<commit_message>
Restore evidence journal and update paired Athena learning records
Restore the test-results clock journal exactly to its pre-29bd87c version.
Integrate verified 19 September bench work into the existing formatted clock
and Z80 records under docs/architecture, retaining their original media,
styles and historical measurements.

Record unresolved source discrepancies and the unavailable later annotated
analyser figure explicitly. Only the three existing DOCX files are changed.
</commit_message>
<xml_diff>
--- a/docs/architecture/Athena_Clock_Module_Build_Verification_and_Learning_Record.docx
+++ b/docs/architecture/Athena_Clock_Module_Build_Verification_and_Learning_Record.docx
@@ -55,7 +55,7 @@
         <w:jc w:val="center"/>
       </w:pPr>
       <w:r>
-        <w:t>Repository baseline and bench evidence consolidated to 18 September 2026</w:t>
+        <w:t xml:space="preserve">Repository baseline and bench evidence consolidated to 19 September 2026</w:t>
       </w:r>
     </w:p>
     <w:p/>
@@ -193,9 +193,18 @@
     <w:p>
       <w:pPr>
         <w:pStyle w:val="ListBullet"/>
+        <w:widowControl/>
       </w:pPr>
       <w:r>
-        <w:t>Because MANUAL/STEP produces exactly one CPU_CLK pulse per button press, a connected Z80 can later be advanced by one T-state at a time. This turns the clock into a deliberate CPU timing and bus-observation tool, not merely a slow clock source.</w:t>
+        <w:t xml:space="preserve">19 September: the STEP RC/Schmitt stage removed the observed trigger chatter, and RUN-mode propagation rejected STEP at every tested stage. The final clock at Z80 pin 6 measured approximately 270.407 kHz.</w:t>
+      </w:r>
+    </w:p>
+    <w:p>
+      <w:pPr>
+        <w:pStyle w:val="ListBullet"/>
+      </w:pPr>
+      <w:r>
+        <w:t xml:space="preserve">Manual STEP is now conditioned by a CD40106BE: the retained 19 September capture showed one clean CPU_CLK pulse per deliberate press. This enables controlled clock/T-state investigation, subject to the connected CPU’s timing limits; reliable hand-stepped execution of the NMOS Z80 is not established.</w:t>
       </w:r>
     </w:p>
     <w:p>
@@ -221,7 +230,7 @@
     </w:p>
     <w:p>
       <w:r>
-        <w:t>The current Athena design then reorganised those functions into a more explicit architecture: generation, state, selection, gating and output. The result is not a copy of the Ben Eater clock. It retains the same educational objectives while using a dual 556 timer, TTL NAND logic and a dedicated multiplexer.</w:t>
+        <w:t xml:space="preserve">The current Athena design separates input conditioning, clock generation, stored mode, source selection, gating and output. It retains the Ben Eater learning objectives while using an NE556, TTL NAND logic, a dedicated multiplexer and, from 19 September, CD40106BE Schmitt conditioning.</w:t>
       </w:r>
     </w:p>
     <w:tbl>
@@ -576,7 +585,7 @@
           <w:b/>
           <w:sz w:val="24"/>
         </w:rPr>
-        <w:t>NE556 clock sources → SN7400 mode latch → SN74LS157 selector → SN7400 HLT gating → CPU_CLK</w:t>
+        <w:t xml:space="preserve">Manual path: STEP → CD40106BE RC/Schmitt conditioning → NE556 Timer 2. RUN path: NE556 Timer 1. Both sources feed SN74LS157 → SN7400 HLT gating → CPU_CLK; the SN7400 latch controls the selector.</w:t>
       </w:r>
     </w:p>
     <w:p>
@@ -589,7 +598,7 @@
         <w:pStyle w:val="Heading2"/>
       </w:pPr>
       <w:r>
-        <w:t>4.1 Functional roles of the three ICs</w:t>
+        <w:t xml:space="preserve">4.1 Functional roles of the three original ICs</w:t>
       </w:r>
     </w:p>
     <w:tbl>
@@ -823,6 +832,24 @@
     <w:p/>
     <w:p>
       <w:pPr>
+        <w:pStyle w:val="Heading2"/>
+        <w:keepNext/>
+        <w:widowControl/>
+      </w:pPr>
+      <w:r>
+        <w:t xml:space="preserve">4.2 U4: CD40106BE input conditioning — 19 September 2026</w:t>
+      </w:r>
+    </w:p>
+    <w:p>
+      <w:pPr>
+        <w:widowControl/>
+      </w:pPr>
+      <w:r>
+        <w:t xml:space="preserve">A fourth IC now conditions STEP before NE556 Timer 2. Two Schmitt inverters preserve the original active-LOW polarity. The RC node is directly observable at pin 1 and the conditioned trigger at NE556 pin 8.</w:t>
+      </w:r>
+    </w:p>
+    <w:p>
+      <w:pPr>
         <w:pStyle w:val="Heading1"/>
       </w:pPr>
       <w:r>
@@ -882,7 +909,7 @@
           <w:i/>
           <w:sz w:val="17"/>
         </w:rPr>
-        <w:t>Figure 1. Current KiCad clock-sheet topology, reproduced from the repository schematic/export record.</w:t>
+        <w:t xml:space="preserve">Figure 1. Historical KiCad clock-sheet topology before the 19 September debounce addition; retained as baseline evidence.</w:t>
       </w:r>
     </w:p>
     <w:p>
@@ -893,10 +920,10 @@
         <w:rPr>
           <w:b/>
         </w:rPr>
-        <w:t xml:space="preserve">Repository status: </w:t>
+        <w:t xml:space="preserve">Historical repository status: </w:t>
       </w:r>
       <w:r>
-        <w:t>ERC was recorded as 0 errors and 1 warning; the warning is expected because CPU_CLK terminates at the module boundary while the receiving CPU lies outside the clock sheet.</w:t>
+        <w:t xml:space="preserve">ERC was recorded as 0 errors and 1 warning for the earlier schematic; the warning concerned CPU_CLK at the module boundary. This is not an ERC result for the current debounce circuitry.</w:t>
       </w:r>
     </w:p>
     <w:p>
@@ -975,6 +1002,39 @@
       </w:pPr>
       <w:r>
         <w:t>Unused SN74LS157 data inputs are intended to be held at a defined logic level; the current breadboard should be checked before the schematic is promoted to definitive as-built status.</w:t>
+      </w:r>
+    </w:p>
+    <w:p>
+      <w:pPr>
+        <w:pStyle w:val="Heading2"/>
+        <w:keepNext/>
+        <w:widowControl/>
+      </w:pPr>
+      <w:r>
+        <w:t xml:space="preserve">5.2 Current schematic limitation — 19 September 2026</w:t>
+      </w:r>
+    </w:p>
+    <w:p>
+      <w:pPr>
+        <w:pStyle w:val="EvidenceNote"/>
+        <w:widowControl/>
+      </w:pPr>
+      <w:r>
+        <w:rPr>
+          <w:b/>
+        </w:rPr>
+        <w:t xml:space="preserve">Documented discrepancy: </w:t>
+      </w:r>
+      <w:r>
+        <w:t xml:space="preserve">At repository commit ffd4e58, the debounce symbols and wiring are appended after the closing main structure in Clock.kicad_sch. A KiCad 10.0.3 export of Athena.kicad_sch omits U4, R9 and C6. The appended symbols also retain U1 reference properties and rel_osc instance labels. The claimed schematic update therefore does not yet form a usable as-built circuit.</w:t>
+      </w:r>
+    </w:p>
+    <w:p>
+      <w:pPr>
+        <w:widowControl/>
+      </w:pPr>
+      <w:r>
+        <w:t xml:space="preserve">Figure 1 and the existing ERC/export remain historical. The verified breadboard connections in section 7.4 take precedence for the debounce build; the schematic needs repair and a fresh connectivity check.</w:t>
       </w:r>
     </w:p>
     <w:p>
@@ -1600,7 +1660,7 @@
     </w:p>
     <w:p>
       <w:r>
-        <w:t>Timer 2 is a monostable one-shot. Its trigger input is normally held HIGH through 10 kΩ. Pressing STEP pulls pin 8 LOW. The internal latch then changes state, the discharge transistor releases the timing node, the capacitor charges through the 1 MΩ timing resistor, and the output pulse ends when the threshold comparator detects the timing node reaching its threshold.</w:t>
+        <w:t xml:space="preserve">Historical direct-switch configuration: Timer 2’s trigger was held HIGH through 10 kΩ and STEP pulled NE556 pin 8 LOW directly. From 19 September, CD40106BE pin 4 drives pin 8 instead; the former pull-up/direct-switch connection is superseded. The monostable mechanism remains: the trigger comparator sets the latch, the discharge transistor releases the timing node, the capacitor charges through 1 MΩ, and the threshold comparator ends the pulse.</w:t>
       </w:r>
     </w:p>
     <w:p>
@@ -1608,7 +1668,7 @@
         <w:pStyle w:val="Heading2"/>
       </w:pPr>
       <w:r>
-        <w:t>7.1 Verified trigger and output behaviour</w:t>
+        <w:t xml:space="preserve">7.1 Historical trigger and output measurements</w:t>
       </w:r>
     </w:p>
     <w:tbl>
@@ -2074,6 +2134,391 @@
     </w:p>
     <w:p>
       <w:pPr>
+        <w:pStyle w:val="Heading2"/>
+        <w:keepNext/>
+        <w:widowControl/>
+      </w:pPr>
+      <w:r>
+        <w:t xml:space="preserve">7.3 STEP chatter diagnosis — 19 September 2026</w:t>
+      </w:r>
+    </w:p>
+    <w:p>
+      <w:pPr>
+        <w:widowControl/>
+      </w:pPr>
+      <w:r>
+        <w:t xml:space="preserve">DSLogic showed multiple unintended CPU-clock transitions during manual stepping. Scope tracing moved backwards through the clock path: disturbance was observed at NE556 pin 9, then chatter directly at pin 8. This located an input disturbance upstream of the monostable output rather than merely inferring a downstream selector fault.</w:t>
+      </w:r>
+    </w:p>
+    <w:p>
+      <w:pPr>
+        <w:widowControl/>
+      </w:pPr>
+      <w:r>
+        <w:t xml:space="preserve">A hand-held jumper was an imperfect switch-bypass diagnostic because hand movement itself introduced chatter. Replacing the original switch with a better 6 mm tactile switch made the waveform substantially cleaner, but the retained analyser test still showed an unwanted additional short pulse. Mechanical switch quality alone did not establish single-clock operation.</w:t>
+      </w:r>
+    </w:p>
+    <w:p>
+      <w:pPr>
+        <w:pStyle w:val="EvidenceNote"/>
+        <w:widowControl/>
+      </w:pPr>
+      <w:r>
+        <w:rPr>
+          <w:b/>
+        </w:rPr>
+        <w:t xml:space="preserve">Deduction: </w:t>
+      </w:r>
+      <w:r>
+        <w:t xml:space="preserve">Hardware conditioning was required. The CD40106BE solution was selected from available stock and derived from measurement and deduction from the observed fault; it was not copied from an existing Z80 clock design.</w:t>
+      </w:r>
+    </w:p>
+    <w:p>
+      <w:pPr>
+        <w:pStyle w:val="Heading3"/>
+        <w:keepNext/>
+        <w:widowControl/>
+      </w:pPr>
+      <w:r>
+        <w:t xml:space="preserve">Alternatives investigated</w:t>
+      </w:r>
+    </w:p>
+    <w:p>
+      <w:pPr>
+        <w:widowControl/>
+      </w:pPr>
+      <w:r>
+        <w:t xml:space="preserve">CD4093BE Schmitt NAND logic; comparator hysteresis using LM393, HA17393 or AN1319; an SN7400 NAND SR latch with an SPDT momentary switch; 74LS123 monostable conditioning; flip-flop approaches; and modification of the existing 556 trigger network were considered. These expose distinct mechanisms—hysteresis, state memory and pulse shaping—and remain meaningful possible experiments. They are not recorded as built or verified alternatives.</w:t>
+      </w:r>
+    </w:p>
+    <w:p>
+      <w:pPr>
+        <w:pStyle w:val="Heading2"/>
+        <w:keepNext/>
+        <w:widowControl/>
+      </w:pPr>
+      <w:r>
+        <w:t xml:space="preserve">7.4 Current as-built CD40106BE STEP network</w:t>
+      </w:r>
+    </w:p>
+    <w:p>
+      <w:pPr>
+        <w:pStyle w:val="ListBullet"/>
+        <w:widowControl/>
+      </w:pPr>
+      <w:r>
+        <w:t xml:space="preserve">Pin 14 → +5 V.</w:t>
+      </w:r>
+    </w:p>
+    <w:p>
+      <w:pPr>
+        <w:pStyle w:val="ListBullet"/>
+        <w:widowControl/>
+      </w:pPr>
+      <w:r>
+        <w:t xml:space="preserve">Pin 7 → GND.</w:t>
+      </w:r>
+    </w:p>
+    <w:p>
+      <w:pPr>
+        <w:pStyle w:val="ListBullet"/>
+        <w:widowControl/>
+      </w:pPr>
+      <w:r>
+        <w:t xml:space="preserve">Pin 1 → 47 kΩ → +5 V.</w:t>
+      </w:r>
+    </w:p>
+    <w:p>
+      <w:pPr>
+        <w:pStyle w:val="ListBullet"/>
+        <w:widowControl/>
+      </w:pPr>
+      <w:r>
+        <w:t xml:space="preserve">Pin 1 → 100 nF → GND.</w:t>
+      </w:r>
+    </w:p>
+    <w:p>
+      <w:pPr>
+        <w:pStyle w:val="ListBullet"/>
+        <w:widowControl/>
+      </w:pPr>
+      <w:r>
+        <w:t xml:space="preserve">Pin 1 → 1 kΩ → normally-open STEP switch → GND.</w:t>
+      </w:r>
+    </w:p>
+    <w:p>
+      <w:pPr>
+        <w:pStyle w:val="ListBullet"/>
+        <w:widowControl/>
+      </w:pPr>
+      <w:r>
+        <w:t xml:space="preserve">Pin 2 → pin 3.</w:t>
+      </w:r>
+    </w:p>
+    <w:p>
+      <w:pPr>
+        <w:pStyle w:val="ListBullet"/>
+        <w:widowControl/>
+      </w:pPr>
+      <w:r>
+        <w:t xml:space="preserve">Pin 4 → NE556 pin 8.</w:t>
+      </w:r>
+    </w:p>
+    <w:p>
+      <w:pPr>
+        <w:pStyle w:val="ListBullet"/>
+        <w:widowControl/>
+      </w:pPr>
+      <w:r>
+        <w:t xml:space="preserve">Unused inputs, pins 5, 9, 11 and 13, are held at defined levels; the confirmed build record specifies GND.</w:t>
+      </w:r>
+    </w:p>
+    <w:p>
+      <w:pPr>
+        <w:pStyle w:val="ListBullet"/>
+        <w:widowControl/>
+      </w:pPr>
+      <w:r>
+        <w:t xml:space="preserve">Unused outputs, pins 6, 8, 10 and 12, are unconnected.</w:t>
+      </w:r>
+    </w:p>
+    <w:p>
+      <w:pPr>
+        <w:pStyle w:val="ListBullet"/>
+        <w:widowControl/>
+      </w:pPr>
+      <w:r>
+        <w:t xml:space="preserve">The former direct 10 kΩ pull-up / STEP-switch connection at NE556 pin 8 is superseded.</w:t>
+      </w:r>
+    </w:p>
+    <w:p>
+      <w:pPr>
+        <w:widowControl/>
+      </w:pPr>
+      <w:r>
+        <w:t xml:space="preserve">The capacitor charges through 47 kΩ when the switch is open and discharges through the switched 1 kΩ path when pressed. The first inverter uses different rising and falling thresholds; its hysteresis prevents small RC-node reversals from repeatedly changing the output. The second inverter restores HIGH at rest and LOW on STEP. Exact switching thresholds and delay were not measured in this session.</w:t>
+      </w:r>
+    </w:p>
+    <w:p>
+      <w:pPr>
+        <w:pStyle w:val="Heading2"/>
+        <w:keepNext/>
+        <w:widowControl/>
+      </w:pPr>
+      <w:r>
+        <w:t xml:space="preserve">7.5 Local scope verification</w:t>
+      </w:r>
+    </w:p>
+    <w:p>
+      <w:pPr>
+        <w:pStyle w:val="Heading3"/>
+        <w:keepNext/>
+        <w:widowControl/>
+      </w:pPr>
+      <w:r>
+        <w:t xml:space="preserve">CD40106BE pin 1 — STEP RC input</w:t>
+      </w:r>
+    </w:p>
+    <w:p>
+      <w:pPr>
+        <w:pStyle w:val="EvidenceNote"/>
+        <w:widowControl/>
+      </w:pPr>
+      <w:r>
+        <w:rPr>
+          <w:b/>
+        </w:rPr>
+        <w:t xml:space="preserve">What it does: </w:t>
+      </w:r>
+      <w:r>
+        <w:t xml:space="preserve">Feeds the first inverter’s internal hysteretic switching stage.</w:t>
+      </w:r>
+    </w:p>
+    <w:p>
+      <w:pPr>
+        <w:pStyle w:val="EvidenceNote"/>
+        <w:widowControl/>
+      </w:pPr>
+      <w:r>
+        <w:rPr>
+          <w:b/>
+        </w:rPr>
+        <w:t xml:space="preserve">What is connected to it: </w:t>
+      </w:r>
+      <w:r>
+        <w:t xml:space="preserve">47 kΩ to +5 V, 100 nF to GND and 1 kΩ through the normally-open STEP switch to GND.</w:t>
+      </w:r>
+    </w:p>
+    <w:p>
+      <w:pPr>
+        <w:pStyle w:val="EvidenceNote"/>
+        <w:widowControl/>
+      </w:pPr>
+      <w:r>
+        <w:rPr>
+          <w:b/>
+        </w:rPr>
+        <w:t xml:space="preserve">Expected: </w:t>
+      </w:r>
+      <w:r>
+        <w:t xml:space="preserve">An analogue fall on pressing STEP and recovery towards HIGH on release.</w:t>
+      </w:r>
+    </w:p>
+    <w:p>
+      <w:pPr>
+        <w:pStyle w:val="EvidenceNote"/>
+        <w:widowControl/>
+      </w:pPr>
+      <w:r>
+        <w:rPr>
+          <w:b/>
+        </w:rPr>
+        <w:t xml:space="preserve">Why: </w:t>
+      </w:r>
+      <w:r>
+        <w:t xml:space="preserve">The capacitor stores charge and the resistor paths limit its rate of change; the Schmitt stage switches at distinct directional thresholds.</w:t>
+      </w:r>
+    </w:p>
+    <w:p>
+      <w:pPr>
+        <w:pStyle w:val="EvidenceNote"/>
+        <w:widowControl/>
+      </w:pPr>
+      <w:r>
+        <w:rPr>
+          <w:b/>
+        </w:rPr>
+        <w:t xml:space="preserve">Observed: </w:t>
+      </w:r>
+      <w:r>
+        <w:t xml:space="preserve">The yellow scope channel monitored pin 1 and showed the expected analogue transition. Exact voltage extrema and delay are not established.</w:t>
+      </w:r>
+    </w:p>
+    <w:p>
+      <w:pPr>
+        <w:pStyle w:val="EvidenceNote"/>
+        <w:widowControl/>
+      </w:pPr>
+      <w:r>
+        <w:rPr>
+          <w:b/>
+        </w:rPr>
+        <w:t xml:space="preserve">Conclusion: </w:t>
+      </w:r>
+      <w:r>
+        <w:t xml:space="preserve">The RC input responded as expected in the captured test.</w:t>
+      </w:r>
+    </w:p>
+    <w:p>
+      <w:pPr>
+        <w:pStyle w:val="Heading3"/>
+        <w:keepNext/>
+        <w:widowControl/>
+      </w:pPr>
+      <w:r>
+        <w:t xml:space="preserve">NE556 pin 8 — TRIGGER2 — conditioned STEP input</w:t>
+      </w:r>
+    </w:p>
+    <w:p>
+      <w:pPr>
+        <w:pStyle w:val="EvidenceNote"/>
+        <w:widowControl/>
+      </w:pPr>
+      <w:r>
+        <w:rPr>
+          <w:b/>
+        </w:rPr>
+        <w:t xml:space="preserve">What it does: </w:t>
+      </w:r>
+      <w:r>
+        <w:t xml:space="preserve">The trigger comparator sets Timer 2’s latch when the input falls below its lower reference.</w:t>
+      </w:r>
+    </w:p>
+    <w:p>
+      <w:pPr>
+        <w:pStyle w:val="EvidenceNote"/>
+        <w:widowControl/>
+      </w:pPr>
+      <w:r>
+        <w:rPr>
+          <w:b/>
+        </w:rPr>
+        <w:t xml:space="preserve">What is connected to it: </w:t>
+      </w:r>
+      <w:r>
+        <w:t xml:space="preserve">CD40106BE pin 4, after two Schmitt inversions.</w:t>
+      </w:r>
+    </w:p>
+    <w:p>
+      <w:pPr>
+        <w:pStyle w:val="EvidenceNote"/>
+        <w:widowControl/>
+      </w:pPr>
+      <w:r>
+        <w:rPr>
+          <w:b/>
+        </w:rPr>
+        <w:t xml:space="preserve">Expected: </w:t>
+      </w:r>
+      <w:r>
+        <w:t xml:space="preserve">HIGH at rest and one clean LOW-going trigger on a deliberate press.</w:t>
+      </w:r>
+    </w:p>
+    <w:p>
+      <w:pPr>
+        <w:pStyle w:val="EvidenceNote"/>
+        <w:widowControl/>
+      </w:pPr>
+      <w:r>
+        <w:rPr>
+          <w:b/>
+        </w:rPr>
+        <w:t xml:space="preserve">Why: </w:t>
+      </w:r>
+      <w:r>
+        <w:t xml:space="preserve">The second inverter restores the active-LOW polarity; the 556 then produces the monostable pulse using its own timing network.</w:t>
+      </w:r>
+    </w:p>
+    <w:p>
+      <w:pPr>
+        <w:pStyle w:val="EvidenceNote"/>
+        <w:widowControl/>
+      </w:pPr>
+      <w:r>
+        <w:rPr>
+          <w:b/>
+        </w:rPr>
+        <w:t xml:space="preserve">Observed: </w:t>
+      </w:r>
+      <w:r>
+        <w:t xml:space="preserve">The blue channel monitored pin 8 alongside the pin-1 RC trace. Pin 8 changed cleanly with no visible chatter at the test timebase. The resting HIGH polarity was confirmed; no new exact voltage extrema were established.</w:t>
+      </w:r>
+    </w:p>
+    <w:p>
+      <w:pPr>
+        <w:pStyle w:val="EvidenceNote"/>
+        <w:widowControl/>
+      </w:pPr>
+      <w:r>
+        <w:rPr>
+          <w:b/>
+        </w:rPr>
+        <w:t xml:space="preserve">Conclusion: </w:t>
+      </w:r>
+      <w:r>
+        <w:t xml:space="preserve">Pin 8 is behaving correctly for the tested conditioned STEP event. The earlier section 7.1 measurements remain evidence for the superseded direct-switch configuration.</w:t>
+      </w:r>
+    </w:p>
+    <w:p>
+      <w:pPr>
+        <w:widowControl/>
+      </w:pPr>
+      <w:r>
+        <w:t xml:space="preserve">Released state: the charged RC node produces LOW at CD40106BE pin 2 and HIGH at pin 4, leaving the 556 trigger inactive. Pressed state: the RC voltage falls, pin 2 becomes HIGH and pin 4 LOW, allowing the trigger comparator to start the monostable. These state explanations are deductions from the verified wiring; they do not introduce additional measured values.</w:t>
+      </w:r>
+    </w:p>
+    <w:p>
+      <w:pPr>
         <w:pStyle w:val="Heading1"/>
       </w:pPr>
       <w:r>
@@ -2390,6 +2835,9 @@
             <w:shd w:fill="EDEDED"/>
           </w:tcPr>
           <w:p>
+            <w:pPr>
+              <w:keepNext/>
+            </w:pPr>
             <w:r/>
             <w:r>
               <w:rPr>
@@ -2408,6 +2856,9 @@
             <w:shd w:fill="EDEDED"/>
           </w:tcPr>
           <w:p>
+            <w:pPr>
+              <w:keepNext/>
+            </w:pPr>
             <w:r/>
             <w:r>
               <w:rPr>
@@ -2426,6 +2877,9 @@
             <w:shd w:fill="EDEDED"/>
           </w:tcPr>
           <w:p>
+            <w:pPr>
+              <w:keepNext/>
+            </w:pPr>
             <w:r/>
             <w:r>
               <w:rPr>
@@ -2445,6 +2899,9 @@
             <w:vAlign w:val="center"/>
           </w:tcPr>
           <w:p>
+            <w:pPr>
+              <w:keepNext/>
+            </w:pPr>
             <w:r/>
             <w:r>
               <w:rPr>
@@ -2462,6 +2919,9 @@
             <w:vAlign w:val="center"/>
           </w:tcPr>
           <w:p>
+            <w:pPr>
+              <w:keepNext/>
+            </w:pPr>
             <w:r/>
             <w:r>
               <w:rPr>
@@ -2479,6 +2939,9 @@
             <w:vAlign w:val="center"/>
           </w:tcPr>
           <w:p>
+            <w:pPr>
+              <w:keepNext/>
+            </w:pPr>
             <w:r/>
             <w:r>
               <w:rPr>
@@ -2498,6 +2961,9 @@
             <w:vAlign w:val="center"/>
           </w:tcPr>
           <w:p>
+            <w:pPr>
+              <w:keepNext/>
+            </w:pPr>
             <w:r/>
             <w:r>
               <w:rPr>
@@ -2515,6 +2981,9 @@
             <w:vAlign w:val="center"/>
           </w:tcPr>
           <w:p>
+            <w:pPr>
+              <w:keepNext/>
+            </w:pPr>
             <w:r/>
             <w:r>
               <w:rPr>
@@ -2532,6 +3001,9 @@
             <w:vAlign w:val="center"/>
           </w:tcPr>
           <w:p>
+            <w:pPr>
+              <w:keepNext/>
+            </w:pPr>
             <w:r/>
             <w:r>
               <w:rPr>
@@ -2551,6 +3023,9 @@
             <w:vAlign w:val="center"/>
           </w:tcPr>
           <w:p>
+            <w:pPr>
+              <w:keepNext/>
+            </w:pPr>
             <w:r/>
             <w:r>
               <w:rPr>
@@ -2568,6 +3043,9 @@
             <w:vAlign w:val="center"/>
           </w:tcPr>
           <w:p>
+            <w:pPr>
+              <w:keepNext/>
+            </w:pPr>
             <w:r/>
             <w:r>
               <w:rPr>
@@ -2585,6 +3063,9 @@
             <w:vAlign w:val="center"/>
           </w:tcPr>
           <w:p>
+            <w:pPr>
+              <w:keepNext/>
+            </w:pPr>
             <w:r/>
             <w:r>
               <w:rPr>
@@ -2604,6 +3085,9 @@
             <w:vAlign w:val="center"/>
           </w:tcPr>
           <w:p>
+            <w:pPr>
+              <w:keepNext/>
+            </w:pPr>
             <w:r/>
             <w:r>
               <w:rPr>
@@ -2621,6 +3105,9 @@
             <w:vAlign w:val="center"/>
           </w:tcPr>
           <w:p>
+            <w:pPr>
+              <w:keepNext/>
+            </w:pPr>
             <w:r/>
             <w:r>
               <w:rPr>
@@ -2638,6 +3125,9 @@
             <w:vAlign w:val="center"/>
           </w:tcPr>
           <w:p>
+            <w:pPr>
+              <w:keepNext/>
+            </w:pPr>
             <w:r/>
             <w:r>
               <w:rPr>
@@ -2657,6 +3147,9 @@
             <w:vAlign w:val="center"/>
           </w:tcPr>
           <w:p>
+            <w:pPr>
+              <w:keepNext/>
+            </w:pPr>
             <w:r/>
             <w:r>
               <w:rPr>
@@ -2674,6 +3167,9 @@
             <w:vAlign w:val="center"/>
           </w:tcPr>
           <w:p>
+            <w:pPr>
+              <w:keepNext/>
+            </w:pPr>
             <w:r/>
             <w:r>
               <w:rPr>
@@ -2691,6 +3187,9 @@
             <w:vAlign w:val="center"/>
           </w:tcPr>
           <w:p>
+            <w:pPr>
+              <w:keepNext/>
+            </w:pPr>
             <w:r/>
             <w:r>
               <w:rPr>
@@ -2710,6 +3209,9 @@
             <w:vAlign w:val="center"/>
           </w:tcPr>
           <w:p>
+            <w:pPr>
+              <w:keepNext/>
+            </w:pPr>
             <w:r/>
             <w:r>
               <w:rPr>
@@ -2727,6 +3229,9 @@
             <w:vAlign w:val="center"/>
           </w:tcPr>
           <w:p>
+            <w:pPr>
+              <w:keepNext/>
+            </w:pPr>
             <w:r/>
             <w:r>
               <w:rPr>
@@ -2744,6 +3249,9 @@
             <w:vAlign w:val="center"/>
           </w:tcPr>
           <w:p>
+            <w:pPr>
+              <w:keepNext/>
+            </w:pPr>
             <w:r/>
             <w:r>
               <w:rPr>
@@ -2830,6 +3338,54 @@
     </w:p>
     <w:p>
       <w:pPr>
+        <w:pStyle w:val="Heading2"/>
+        <w:keepNext/>
+        <w:widowControl/>
+      </w:pPr>
+      <w:r>
+        <w:t xml:space="preserve">9.1 RUN/MANUAL propagation recheck — 19 September 2026</w:t>
+      </w:r>
+    </w:p>
+    <w:p>
+      <w:pPr>
+        <w:pStyle w:val="EvidenceNote"/>
+        <w:widowControl/>
+      </w:pPr>
+      <w:r>
+        <w:rPr>
+          <w:b/>
+        </w:rPr>
+        <w:t xml:space="preserve">Observed: </w:t>
+      </w:r>
+      <w:r>
+        <w:t xml:space="preserve">SN74LS157 pin 1 measured 0 V in MANUAL and approximately 3.6 V in RUN. With RUN selected, pressing STEP caused no STEP-correlated change at SN74LS157 pin 4 (1Y), SN7400 pin 9 (3A), or SN7400 pin 11 (4Y).</w:t>
+      </w:r>
+    </w:p>
+    <w:p>
+      <w:pPr>
+        <w:pStyle w:val="EvidenceNote"/>
+        <w:widowControl/>
+      </w:pPr>
+      <w:r>
+        <w:rPr>
+          <w:b/>
+        </w:rPr>
+        <w:t xml:space="preserve">Conclusion: </w:t>
+      </w:r>
+      <w:r>
+        <w:t xml:space="preserve">The tested propagation path correctly rejects the manual source while RUN is selected.</w:t>
+      </w:r>
+    </w:p>
+    <w:p>
+      <w:pPr>
+        <w:widowControl/>
+      </w:pPr>
+      <w:r>
+        <w:t xml:space="preserve">An earlier apparent STEP-through-RUN event could not be reproduced after temporary wiring and probe arrangements were stabilised and each stage was checked directly. It remains recorded as a transient debugging/probing artefact; the exact disturbed contact or probe mechanism was not isolated. This event is separate from the older selector-bypass fault in section 11.</w:t>
+      </w:r>
+    </w:p>
+    <w:p>
+      <w:pPr>
         <w:pStyle w:val="Heading1"/>
       </w:pPr>
       <w:r>
@@ -2860,6 +3416,9 @@
             <w:shd w:fill="EDEDED"/>
           </w:tcPr>
           <w:p>
+            <w:pPr>
+              <w:keepNext/>
+            </w:pPr>
             <w:r/>
             <w:r>
               <w:rPr>
@@ -2878,6 +3437,9 @@
             <w:shd w:fill="EDEDED"/>
           </w:tcPr>
           <w:p>
+            <w:pPr>
+              <w:keepNext/>
+            </w:pPr>
             <w:r/>
             <w:r>
               <w:rPr>
@@ -2897,6 +3459,9 @@
             <w:vAlign w:val="center"/>
           </w:tcPr>
           <w:p>
+            <w:pPr>
+              <w:keepNext/>
+            </w:pPr>
             <w:r/>
             <w:r>
               <w:rPr>
@@ -2914,6 +3479,9 @@
             <w:vAlign w:val="center"/>
           </w:tcPr>
           <w:p>
+            <w:pPr>
+              <w:keepNext/>
+            </w:pPr>
             <w:r/>
             <w:r>
               <w:rPr>
@@ -2933,6 +3501,9 @@
             <w:vAlign w:val="center"/>
           </w:tcPr>
           <w:p>
+            <w:pPr>
+              <w:keepNext/>
+            </w:pPr>
             <w:r/>
             <w:r>
               <w:rPr>
@@ -2950,6 +3521,9 @@
             <w:vAlign w:val="center"/>
           </w:tcPr>
           <w:p>
+            <w:pPr>
+              <w:keepNext/>
+            </w:pPr>
             <w:r/>
             <w:r>
               <w:rPr>
@@ -2969,6 +3543,9 @@
             <w:vAlign w:val="center"/>
           </w:tcPr>
           <w:p>
+            <w:pPr>
+              <w:keepNext/>
+            </w:pPr>
             <w:r/>
             <w:r>
               <w:rPr>
@@ -2986,6 +3563,9 @@
             <w:vAlign w:val="center"/>
           </w:tcPr>
           <w:p>
+            <w:pPr>
+              <w:keepNext/>
+            </w:pPr>
             <w:r/>
             <w:r>
               <w:rPr>
@@ -3005,6 +3585,9 @@
             <w:vAlign w:val="center"/>
           </w:tcPr>
           <w:p>
+            <w:pPr>
+              <w:keepNext/>
+            </w:pPr>
             <w:r/>
             <w:r>
               <w:rPr>
@@ -3022,6 +3605,9 @@
             <w:vAlign w:val="center"/>
           </w:tcPr>
           <w:p>
+            <w:pPr>
+              <w:keepNext/>
+            </w:pPr>
             <w:r/>
             <w:r>
               <w:rPr>
@@ -3542,7 +4128,55 @@
     <w:p/>
     <w:p>
       <w:r>
-        <w:t>At this point the clock module was functionally complete for its intended architecture. The result was not merely that pin 11 toggled: the individual sources, stored mode, selector and halt gate had each been understood and exercised.</w:t>
+        <w:t xml:space="preserve">The earlier tests established the module’s functional architecture. The 19 September chatter investigation showed that this did not yet establish clean single-clock generation for every tested switch action. That additional requirement was verified after hardware conditioning, as recorded above.</w:t>
+      </w:r>
+    </w:p>
+    <w:p>
+      <w:pPr>
+        <w:pStyle w:val="Heading2"/>
+        <w:keepNext/>
+        <w:widowControl/>
+      </w:pPr>
+      <w:r>
+        <w:t xml:space="preserve">12.1 Clean single-clock verification — 19 September 2026</w:t>
+      </w:r>
+    </w:p>
+    <w:p>
+      <w:pPr>
+        <w:pStyle w:val="EvidenceNote"/>
+        <w:widowControl/>
+      </w:pPr>
+      <w:r>
+        <w:rPr>
+          <w:b/>
+        </w:rPr>
+        <w:t xml:space="preserve">Observed: </w:t>
+      </w:r>
+      <w:r>
+        <w:t xml:space="preserve">The retained post-debounce DSLogic analysis showed nine complete CPU-clock pulses without extra short pulses, one clean pulse per deliberate STEP action in the tested sequence.</w:t>
+      </w:r>
+    </w:p>
+    <w:p>
+      <w:pPr>
+        <w:pStyle w:val="EvidenceNote"/>
+        <w:widowControl/>
+      </w:pPr>
+      <w:r>
+        <w:rPr>
+          <w:b/>
+        </w:rPr>
+        <w:t xml:space="preserve">Milestone: </w:t>
+      </w:r>
+      <w:r>
+        <w:t xml:space="preserve">Manual STEP input debouncing and clean single-clock generation verified — 19 September 2026</w:t>
+      </w:r>
+    </w:p>
+    <w:p>
+      <w:pPr>
+        <w:widowControl/>
+      </w:pPr>
+      <w:r>
+        <w:t xml:space="preserve">This verifies the clock stimulus for the captured switch actions. It does not by itself establish valid CPU execution at long manual clock intervals. The retained manual-capture analysis reported pulse widths around 0.28–0.50 s, differing from the approximately 1.1 s nominal interval for 1 MΩ / 1 µF. The source of that timing difference was not established; the component record and capture analysis are retained without forcing agreement.</w:t>
       </w:r>
     </w:p>
     <w:p>
@@ -3705,17 +4339,17 @@
         <w:pStyle w:val="Heading2"/>
       </w:pPr>
       <w:r>
-        <w:t>13.3 Manual single-T-state stepping capability</w:t>
+        <w:t xml:space="preserve">13.3 Manual single-clock / T-state investigation</w:t>
       </w:r>
     </w:p>
     <w:p>
       <w:r>
-        <w:t>The already-verified MANUAL path has an important consequence once the clock is connected to the Z80: each STEP press produces one clock pulse, so the processor advances by one T-state rather than by one complete instruction.</w:t>
+        <w:t xml:space="preserve">The earlier interpretation was that one STEP press advanced the connected Z80 by one T-state. The 19 September work separated two prerequisites: the switch must generate one clean clock pulse, and the CPU must retain valid internal state throughout its HIGH and LOW clock phases.</w:t>
       </w:r>
     </w:p>
     <w:p>
       <w:r>
-        <w:t>This makes it possible to walk deliberately through an instruction machine cycle and observe when the address bus, data bus and control signals change. Signals of particular interest include A0-A15, D0-D7, M1̄, MREQ̄, RD̄, WR̄, RFSH̄, IORQ̄ and CLK.</w:t>
+        <w:t xml:space="preserve">The conditioned STEP path is available for controlled CPU-response and T-state investigation. Signals of interest remain A0–A15, D0–D7, M1̄, MREQ̄, RD̄, WR̄, RFSH̄, IORQ̄ and CLK. The low-frequency NMOS experiment prevents an unconditional claim that this specimen can be walked through valid instruction cycles at arbitrary hand-stepping speeds.</w:t>
       </w:r>
     </w:p>
     <w:p>
@@ -3726,10 +4360,10 @@
         <w:rPr>
           <w:b/>
         </w:rPr>
-        <w:t xml:space="preserve">Established electrical behaviour: </w:t>
+        <w:t xml:space="preserve">Established electrical behaviour, 19 September: </w:t>
       </w:r>
       <w:r>
-        <w:t>MANUAL mode selects the NE556 monostable and one STEP press produces one pulse at the final CPU_CLK output.</w:t>
+        <w:t xml:space="preserve">MANUAL selects the NE556 monostable, and the post-debounce DSLogic capture showed one clean final CPU_CLK pulse per deliberate STEP action.</w:t>
       </w:r>
     </w:p>
     <w:p>
@@ -3740,10 +4374,10 @@
         <w:rPr>
           <w:b/>
         </w:rPr>
-        <w:t xml:space="preserve">CPU-debugging consequence: </w:t>
+        <w:t xml:space="preserve">Qualification: </w:t>
       </w:r>
       <w:r>
-        <w:t>With the Z80 connected, one pulse advances one T-state. This is a consequence of the clocked CPU architecture and gives the existing clock module a single-cycle observability function.</w:t>
+        <w:t xml:space="preserve">A clean pulse represents one valid T-state only while the CPU’s electrical and timing requirements are satisfied. At very low frequency the NMOS specimen lost coherent bus behaviour; reliable paused execution has not been established.</w:t>
       </w:r>
     </w:p>
     <w:p>
@@ -3757,7 +4391,40 @@
         <w:t xml:space="preserve">Use: </w:t>
       </w:r>
       <w:r>
-        <w:t>Compare each manually advanced T-state with the Z80 timing diagrams and the simultaneously observed bus/control signals. The feature is cycle-level stepping and must not be confused with instruction-level single-step debugging.</w:t>
+        <w:t xml:space="preserve">Compare the measured clock and bus/control response with the Z80 timing model, keeping clean clock generation separate from valid execution. This is clock/T-state investigation, not instruction-level single-step debugging.</w:t>
+      </w:r>
+    </w:p>
+    <w:p>
+      <w:pPr>
+        <w:pStyle w:val="Heading2"/>
+        <w:keepNext/>
+        <w:widowControl/>
+      </w:pPr>
+      <w:r>
+        <w:t xml:space="preserve">13.4 Final-clock RUN regression — 19 September 2026</w:t>
+      </w:r>
+    </w:p>
+    <w:p>
+      <w:pPr>
+        <w:pStyle w:val="EvidenceNote"/>
+        <w:widowControl/>
+      </w:pPr>
+      <w:r>
+        <w:rPr>
+          <w:b/>
+        </w:rPr>
+        <w:t xml:space="preserve">Observed: </w:t>
+      </w:r>
+      <w:r>
+        <w:t xml:space="preserve">The Long Wei TFC-2700L connected to Z80 pin 6, with common Athena ground, measured approximately 270.407 kHz. This checks the final path after selection and HLT gating, independently of the scope and analyser.</w:t>
+      </w:r>
+    </w:p>
+    <w:p>
+      <w:pPr>
+        <w:widowControl/>
+      </w:pPr>
+      <w:r>
+        <w:t xml:space="preserve">Normal RUN-mode forced-NOP bus activity remained coherent after rebuilding and debounce work. The CPU-side observations, low-frequency failure/recovery comparison and unmeasured minimum-frequency boundary are recorded in Athena_Z80_CPU_Bringup_Progress_Record.docx, sections 11.2 and 11.3. The counter reading is a RUN operating point, not a measured failure threshold.</w:t>
       </w:r>
     </w:p>
     <w:p>
@@ -3831,6 +4498,24 @@
     <w:p>
       <w:r>
         <w:t>Because ASTABLE, MANUAL, Q, SELECTED_CLK, CLOCK_ENABLE and CPU_CLK are individually observable, faults can be localised stage by stage. The clock became a chain of testable hypotheses rather than a single 'works/does not work' object.</w:t>
+      </w:r>
+    </w:p>
+    <w:p>
+      <w:pPr>
+        <w:pStyle w:val="Heading2"/>
+        <w:keepNext/>
+        <w:widowControl/>
+      </w:pPr>
+      <w:r>
+        <w:t xml:space="preserve">14.6 Measurement-led design and worthwhile alternatives</w:t>
+      </w:r>
+    </w:p>
+    <w:p>
+      <w:pPr>
+        <w:widowControl/>
+      </w:pPr>
+      <w:r>
+        <w:t xml:space="preserve">The debounce design followed the observed disturbance backwards to its source, then selected a mechanism that addressed it. Athena may deliberately investigate unusual, interesting or historically plausible period-appropriate solutions when they improve educational value, observability or understanding, provided they remain understandable, electrically sound and verifiable. Novelty itself is not a permanent project requirement.</w:t>
       </w:r>
     </w:p>
     <w:p>
@@ -4316,14 +5001,13 @@
             <w:vAlign w:val="center"/>
           </w:tcPr>
           <w:p>
-            <w:r/>
             <w:r>
               <w:rPr>
                 <w:rFonts w:ascii="Aptos" w:hAnsi="Aptos"/>
                 <w:b w:val="0"/>
                 <w:sz w:val="16"/>
               </w:rPr>
-              <w:t>Confirmed baseline</w:t>
+              <w:t xml:space="preserve">Historical baseline only</w:t>
             </w:r>
           </w:p>
         </w:tc>
@@ -4333,14 +5017,13 @@
             <w:vAlign w:val="center"/>
           </w:tcPr>
           <w:p>
-            <w:r/>
             <w:r>
               <w:rPr>
                 <w:rFonts w:ascii="Aptos" w:hAnsi="Aptos"/>
                 <w:b w:val="0"/>
                 <w:sz w:val="16"/>
               </w:rPr>
-              <w:t>Repository netlist/export checked; ERC 0 errors, one expected module-boundary warning.</w:t>
+              <w:t xml:space="preserve">Earlier netlist/export and ERC result predate debounce; the 19 September additions require repair and re-verification.</w:t>
             </w:r>
           </w:p>
         </w:tc>
@@ -4386,14 +5069,13 @@
             <w:vAlign w:val="center"/>
           </w:tcPr>
           <w:p>
-            <w:r/>
             <w:r>
               <w:rPr>
                 <w:rFonts w:ascii="Aptos" w:hAnsi="Aptos"/>
                 <w:b w:val="0"/>
                 <w:sz w:val="16"/>
               </w:rPr>
-              <w:t>Several resistor/LED/bypass/switch details remain TBC; later 470 pF change not yet folded into baseline.</w:t>
+              <w:t xml:space="preserve">Debounce additions are omitted by the loaded schematic/netlist; resistor/LED/bypass/switch details remain TBC and the 470 pF adaptation remains separate.</w:t>
             </w:r>
           </w:p>
         </w:tc>
@@ -4508,6 +5190,21 @@
     <w:p/>
     <w:p>
       <w:pPr>
+        <w:pStyle w:val="EvidenceNote"/>
+        <w:widowControl/>
+      </w:pPr>
+      <w:r>
+        <w:rPr>
+          <w:b/>
+        </w:rPr>
+        <w:t xml:space="preserve">19 September status: </w:t>
+      </w:r>
+      <w:r>
+        <w:t xml:space="preserve">STEP conditioning and clean single-clock generation are verified for the retained tests. RUN-source rejection and the final 270.407 kHz CPU-clock reading are verified. KiCad as-built repair and characterisation of the NMOS low-frequency limit remain open.</w:t>
+      </w:r>
+    </w:p>
+    <w:p>
+      <w:pPr>
         <w:pStyle w:val="Heading1"/>
       </w:pPr>
       <w:r>
@@ -4519,7 +5216,7 @@
         <w:pStyle w:val="ListNumber"/>
       </w:pPr>
       <w:r>
-        <w:t>Use MANUAL/STEP during Z80 timing work to capture and document individual T-states against the processor timing diagrams, preserving this as a deliberate observability feature of the clock architecture.</w:t>
+        <w:t xml:space="preserve">Use the conditioned STEP path for CPU-response investigation, but establish suitable clock-phase limits before treating slow manual pulses as valid NMOS T-state advances.</w:t>
       </w:r>
     </w:p>
     <w:p>
@@ -4602,6 +5299,9 @@
             <w:shd w:fill="EDEDED"/>
           </w:tcPr>
           <w:p>
+            <w:pPr>
+              <w:keepNext/>
+            </w:pPr>
             <w:r/>
             <w:r>
               <w:rPr>
@@ -4620,6 +5320,9 @@
             <w:shd w:fill="EDEDED"/>
           </w:tcPr>
           <w:p>
+            <w:pPr>
+              <w:keepNext/>
+            </w:pPr>
             <w:r/>
             <w:r>
               <w:rPr>
@@ -4639,6 +5342,9 @@
             <w:vAlign w:val="center"/>
           </w:tcPr>
           <w:p>
+            <w:pPr>
+              <w:keepNext/>
+            </w:pPr>
             <w:r/>
             <w:r>
               <w:rPr>
@@ -4656,6 +5362,9 @@
             <w:vAlign w:val="center"/>
           </w:tcPr>
           <w:p>
+            <w:pPr>
+              <w:keepNext/>
+            </w:pPr>
             <w:r/>
             <w:r>
               <w:rPr>
@@ -4675,6 +5384,9 @@
             <w:vAlign w:val="center"/>
           </w:tcPr>
           <w:p>
+            <w:pPr>
+              <w:keepNext/>
+            </w:pPr>
             <w:r/>
             <w:r>
               <w:rPr>
@@ -4692,6 +5404,9 @@
             <w:vAlign w:val="center"/>
           </w:tcPr>
           <w:p>
+            <w:pPr>
+              <w:keepNext/>
+            </w:pPr>
             <w:r/>
             <w:r>
               <w:rPr>
@@ -4711,6 +5426,9 @@
             <w:vAlign w:val="center"/>
           </w:tcPr>
           <w:p>
+            <w:pPr>
+              <w:keepNext/>
+            </w:pPr>
             <w:r/>
             <w:r>
               <w:rPr>
@@ -4728,6 +5446,9 @@
             <w:vAlign w:val="center"/>
           </w:tcPr>
           <w:p>
+            <w:pPr>
+              <w:keepNext/>
+            </w:pPr>
             <w:r/>
             <w:r>
               <w:rPr>
@@ -4747,6 +5468,9 @@
             <w:vAlign w:val="center"/>
           </w:tcPr>
           <w:p>
+            <w:pPr>
+              <w:keepNext/>
+            </w:pPr>
             <w:r/>
             <w:r>
               <w:rPr>
@@ -4764,6 +5488,9 @@
             <w:vAlign w:val="center"/>
           </w:tcPr>
           <w:p>
+            <w:pPr>
+              <w:keepNext/>
+            </w:pPr>
             <w:r/>
             <w:r>
               <w:rPr>
@@ -4783,6 +5510,9 @@
             <w:vAlign w:val="center"/>
           </w:tcPr>
           <w:p>
+            <w:pPr>
+              <w:keepNext/>
+            </w:pPr>
             <w:r/>
             <w:r>
               <w:rPr>
@@ -4800,6 +5530,9 @@
             <w:vAlign w:val="center"/>
           </w:tcPr>
           <w:p>
+            <w:pPr>
+              <w:keepNext/>
+            </w:pPr>
             <w:r/>
             <w:r>
               <w:rPr>
@@ -4819,6 +5552,9 @@
             <w:vAlign w:val="center"/>
           </w:tcPr>
           <w:p>
+            <w:pPr>
+              <w:keepNext/>
+            </w:pPr>
             <w:r/>
             <w:r>
               <w:rPr>
@@ -4836,6 +5572,9 @@
             <w:vAlign w:val="center"/>
           </w:tcPr>
           <w:p>
+            <w:pPr>
+              <w:keepNext/>
+            </w:pPr>
             <w:r/>
             <w:r>
               <w:rPr>
@@ -4855,6 +5594,9 @@
             <w:vAlign w:val="center"/>
           </w:tcPr>
           <w:p>
+            <w:pPr>
+              <w:keepNext/>
+            </w:pPr>
             <w:r/>
             <w:r>
               <w:rPr>
@@ -4872,6 +5614,9 @@
             <w:vAlign w:val="center"/>
           </w:tcPr>
           <w:p>
+            <w:pPr>
+              <w:keepNext/>
+            </w:pPr>
             <w:r/>
             <w:r>
               <w:rPr>
@@ -4891,6 +5636,9 @@
             <w:vAlign w:val="center"/>
           </w:tcPr>
           <w:p>
+            <w:pPr>
+              <w:keepNext/>
+            </w:pPr>
             <w:r/>
             <w:r>
               <w:rPr>
@@ -4908,14 +5656,16 @@
             <w:vAlign w:val="center"/>
           </w:tcPr>
           <w:p>
-            <w:r/>
+            <w:pPr>
+              <w:keepNext/>
+            </w:pPr>
             <w:r>
               <w:rPr>
                 <w:rFonts w:ascii="Aptos" w:hAnsi="Aptos"/>
                 <w:b w:val="0"/>
                 <w:sz w:val="17"/>
               </w:rPr>
-              <w:t>TRIGGER2: 10 kΩ pull-up; STEP switch pulls LOW.</w:t>
+              <w:t xml:space="preserve">TRIGGER2: CD40106BE pin 4 drives the active-LOW trigger. Historical 10 kΩ pull-up/direct STEP switch superseded on 19 September.</w:t>
             </w:r>
           </w:p>
         </w:tc>
@@ -4927,6 +5677,9 @@
             <w:vAlign w:val="center"/>
           </w:tcPr>
           <w:p>
+            <w:pPr>
+              <w:keepNext/>
+            </w:pPr>
             <w:r/>
             <w:r>
               <w:rPr>
@@ -4944,6 +5697,9 @@
             <w:vAlign w:val="center"/>
           </w:tcPr>
           <w:p>
+            <w:pPr>
+              <w:keepNext/>
+            </w:pPr>
             <w:r/>
             <w:r>
               <w:rPr>
@@ -4963,6 +5719,9 @@
             <w:vAlign w:val="center"/>
           </w:tcPr>
           <w:p>
+            <w:pPr>
+              <w:keepNext/>
+            </w:pPr>
             <w:r/>
             <w:r>
               <w:rPr>
@@ -4980,6 +5739,9 @@
             <w:vAlign w:val="center"/>
           </w:tcPr>
           <w:p>
+            <w:pPr>
+              <w:keepNext/>
+            </w:pPr>
             <w:r/>
             <w:r>
               <w:rPr>
@@ -4999,6 +5761,9 @@
             <w:vAlign w:val="center"/>
           </w:tcPr>
           <w:p>
+            <w:pPr>
+              <w:keepNext/>
+            </w:pPr>
             <w:r/>
             <w:r>
               <w:rPr>
@@ -5016,6 +5781,9 @@
             <w:vAlign w:val="center"/>
           </w:tcPr>
           <w:p>
+            <w:pPr>
+              <w:keepNext/>
+            </w:pPr>
             <w:r/>
             <w:r>
               <w:rPr>
@@ -5035,6 +5803,9 @@
             <w:vAlign w:val="center"/>
           </w:tcPr>
           <w:p>
+            <w:pPr>
+              <w:keepNext/>
+            </w:pPr>
             <w:r/>
             <w:r>
               <w:rPr>
@@ -5052,6 +5823,9 @@
             <w:vAlign w:val="center"/>
           </w:tcPr>
           <w:p>
+            <w:pPr>
+              <w:keepNext/>
+            </w:pPr>
             <w:r/>
             <w:r>
               <w:rPr>
@@ -5071,6 +5845,9 @@
             <w:vAlign w:val="center"/>
           </w:tcPr>
           <w:p>
+            <w:pPr>
+              <w:keepNext/>
+            </w:pPr>
             <w:r/>
             <w:r>
               <w:rPr>
@@ -5088,6 +5865,9 @@
             <w:vAlign w:val="center"/>
           </w:tcPr>
           <w:p>
+            <w:pPr>
+              <w:keepNext/>
+            </w:pPr>
             <w:r/>
             <w:r>
               <w:rPr>
@@ -5165,6 +5945,9 @@
             <w:shd w:fill="EDEDED"/>
           </w:tcPr>
           <w:p>
+            <w:pPr>
+              <w:keepNext/>
+            </w:pPr>
             <w:r/>
             <w:r>
               <w:rPr>
@@ -5183,6 +5966,9 @@
             <w:shd w:fill="EDEDED"/>
           </w:tcPr>
           <w:p>
+            <w:pPr>
+              <w:keepNext/>
+            </w:pPr>
             <w:r/>
             <w:r>
               <w:rPr>
@@ -5202,6 +5988,9 @@
             <w:vAlign w:val="center"/>
           </w:tcPr>
           <w:p>
+            <w:pPr>
+              <w:keepNext/>
+            </w:pPr>
             <w:r/>
             <w:r>
               <w:rPr>
@@ -5219,6 +6008,9 @@
             <w:vAlign w:val="center"/>
           </w:tcPr>
           <w:p>
+            <w:pPr>
+              <w:keepNext/>
+            </w:pPr>
             <w:r/>
             <w:r>
               <w:rPr>
@@ -5238,6 +6030,9 @@
             <w:vAlign w:val="center"/>
           </w:tcPr>
           <w:p>
+            <w:pPr>
+              <w:keepNext/>
+            </w:pPr>
             <w:r/>
             <w:r>
               <w:rPr>
@@ -5255,6 +6050,9 @@
             <w:vAlign w:val="center"/>
           </w:tcPr>
           <w:p>
+            <w:pPr>
+              <w:keepNext/>
+            </w:pPr>
             <w:r/>
             <w:r>
               <w:rPr>
@@ -5274,6 +6072,9 @@
             <w:vAlign w:val="center"/>
           </w:tcPr>
           <w:p>
+            <w:pPr>
+              <w:keepNext/>
+            </w:pPr>
             <w:r/>
             <w:r>
               <w:rPr>
@@ -5291,6 +6092,9 @@
             <w:vAlign w:val="center"/>
           </w:tcPr>
           <w:p>
+            <w:pPr>
+              <w:keepNext/>
+            </w:pPr>
             <w:r/>
             <w:r>
               <w:rPr>
@@ -5310,6 +6114,9 @@
             <w:vAlign w:val="center"/>
           </w:tcPr>
           <w:p>
+            <w:pPr>
+              <w:keepNext/>
+            </w:pPr>
             <w:r/>
             <w:r>
               <w:rPr>
@@ -5327,6 +6134,9 @@
             <w:vAlign w:val="center"/>
           </w:tcPr>
           <w:p>
+            <w:pPr>
+              <w:keepNext/>
+            </w:pPr>
             <w:r/>
             <w:r>
               <w:rPr>
@@ -5346,6 +6156,9 @@
             <w:vAlign w:val="center"/>
           </w:tcPr>
           <w:p>
+            <w:pPr>
+              <w:keepNext/>
+            </w:pPr>
             <w:r/>
             <w:r>
               <w:rPr>
@@ -5363,6 +6176,9 @@
             <w:vAlign w:val="center"/>
           </w:tcPr>
           <w:p>
+            <w:pPr>
+              <w:keepNext/>
+            </w:pPr>
             <w:r/>
             <w:r>
               <w:rPr>
@@ -5382,6 +6198,9 @@
             <w:vAlign w:val="center"/>
           </w:tcPr>
           <w:p>
+            <w:pPr>
+              <w:keepNext/>
+            </w:pPr>
             <w:r/>
             <w:r>
               <w:rPr>
@@ -5399,6 +6218,9 @@
             <w:vAlign w:val="center"/>
           </w:tcPr>
           <w:p>
+            <w:pPr>
+              <w:keepNext/>
+            </w:pPr>
             <w:r/>
             <w:r>
               <w:rPr>
@@ -5418,6 +6240,9 @@
             <w:vAlign w:val="center"/>
           </w:tcPr>
           <w:p>
+            <w:pPr>
+              <w:keepNext/>
+            </w:pPr>
             <w:r/>
             <w:r>
               <w:rPr>
@@ -5435,6 +6260,9 @@
             <w:vAlign w:val="center"/>
           </w:tcPr>
           <w:p>
+            <w:pPr>
+              <w:keepNext/>
+            </w:pPr>
             <w:r/>
             <w:r>
               <w:rPr>
@@ -5454,6 +6282,9 @@
             <w:vAlign w:val="center"/>
           </w:tcPr>
           <w:p>
+            <w:pPr>
+              <w:keepNext/>
+            </w:pPr>
             <w:r/>
             <w:r>
               <w:rPr>
@@ -5471,6 +6302,9 @@
             <w:vAlign w:val="center"/>
           </w:tcPr>
           <w:p>
+            <w:pPr>
+              <w:keepNext/>
+            </w:pPr>
             <w:r/>
             <w:r>
               <w:rPr>
@@ -5490,6 +6324,9 @@
             <w:vAlign w:val="center"/>
           </w:tcPr>
           <w:p>
+            <w:pPr>
+              <w:keepNext/>
+            </w:pPr>
             <w:r/>
             <w:r>
               <w:rPr>
@@ -5507,6 +6344,9 @@
             <w:vAlign w:val="center"/>
           </w:tcPr>
           <w:p>
+            <w:pPr>
+              <w:keepNext/>
+            </w:pPr>
             <w:r/>
             <w:r>
               <w:rPr>
@@ -5526,6 +6366,9 @@
             <w:vAlign w:val="center"/>
           </w:tcPr>
           <w:p>
+            <w:pPr>
+              <w:keepNext/>
+            </w:pPr>
             <w:r/>
             <w:r>
               <w:rPr>
@@ -5543,6 +6386,9 @@
             <w:vAlign w:val="center"/>
           </w:tcPr>
           <w:p>
+            <w:pPr>
+              <w:keepNext/>
+            </w:pPr>
             <w:r/>
             <w:r>
               <w:rPr>
@@ -5562,6 +6408,9 @@
             <w:vAlign w:val="center"/>
           </w:tcPr>
           <w:p>
+            <w:pPr>
+              <w:keepNext/>
+            </w:pPr>
             <w:r/>
             <w:r>
               <w:rPr>
@@ -5579,6 +6428,9 @@
             <w:vAlign w:val="center"/>
           </w:tcPr>
           <w:p>
+            <w:pPr>
+              <w:keepNext/>
+            </w:pPr>
             <w:r/>
             <w:r>
               <w:rPr>
@@ -5598,6 +6450,9 @@
             <w:vAlign w:val="center"/>
           </w:tcPr>
           <w:p>
+            <w:pPr>
+              <w:keepNext/>
+            </w:pPr>
             <w:r/>
             <w:r>
               <w:rPr>
@@ -5615,6 +6470,9 @@
             <w:vAlign w:val="center"/>
           </w:tcPr>
           <w:p>
+            <w:pPr>
+              <w:keepNext/>
+            </w:pPr>
             <w:r/>
             <w:r>
               <w:rPr>
@@ -5634,6 +6492,9 @@
             <w:vAlign w:val="center"/>
           </w:tcPr>
           <w:p>
+            <w:pPr>
+              <w:keepNext/>
+            </w:pPr>
             <w:r/>
             <w:r>
               <w:rPr>
@@ -5651,6 +6512,9 @@
             <w:vAlign w:val="center"/>
           </w:tcPr>
           <w:p>
+            <w:pPr>
+              <w:keepNext/>
+            </w:pPr>
             <w:r/>
             <w:r>
               <w:rPr>
@@ -5728,6 +6592,9 @@
             <w:shd w:fill="EDEDED"/>
           </w:tcPr>
           <w:p>
+            <w:pPr>
+              <w:keepNext/>
+            </w:pPr>
             <w:r/>
             <w:r>
               <w:rPr>
@@ -5746,6 +6613,9 @@
             <w:shd w:fill="EDEDED"/>
           </w:tcPr>
           <w:p>
+            <w:pPr>
+              <w:keepNext/>
+            </w:pPr>
             <w:r/>
             <w:r>
               <w:rPr>
@@ -5765,6 +6635,9 @@
             <w:vAlign w:val="center"/>
           </w:tcPr>
           <w:p>
+            <w:pPr>
+              <w:keepNext/>
+            </w:pPr>
             <w:r/>
             <w:r>
               <w:rPr>
@@ -5782,6 +6655,9 @@
             <w:vAlign w:val="center"/>
           </w:tcPr>
           <w:p>
+            <w:pPr>
+              <w:keepNext/>
+            </w:pPr>
             <w:r/>
             <w:r>
               <w:rPr>
@@ -5801,6 +6677,9 @@
             <w:vAlign w:val="center"/>
           </w:tcPr>
           <w:p>
+            <w:pPr>
+              <w:keepNext/>
+            </w:pPr>
             <w:r/>
             <w:r>
               <w:rPr>
@@ -5818,6 +6697,9 @@
             <w:vAlign w:val="center"/>
           </w:tcPr>
           <w:p>
+            <w:pPr>
+              <w:keepNext/>
+            </w:pPr>
             <w:r/>
             <w:r>
               <w:rPr>
@@ -5837,6 +6719,9 @@
             <w:vAlign w:val="center"/>
           </w:tcPr>
           <w:p>
+            <w:pPr>
+              <w:keepNext/>
+            </w:pPr>
             <w:r/>
             <w:r>
               <w:rPr>
@@ -5854,6 +6739,9 @@
             <w:vAlign w:val="center"/>
           </w:tcPr>
           <w:p>
+            <w:pPr>
+              <w:keepNext/>
+            </w:pPr>
             <w:r/>
             <w:r>
               <w:rPr>
@@ -5873,6 +6761,9 @@
             <w:vAlign w:val="center"/>
           </w:tcPr>
           <w:p>
+            <w:pPr>
+              <w:keepNext/>
+            </w:pPr>
             <w:r/>
             <w:r>
               <w:rPr>
@@ -5890,6 +6781,9 @@
             <w:vAlign w:val="center"/>
           </w:tcPr>
           <w:p>
+            <w:pPr>
+              <w:keepNext/>
+            </w:pPr>
             <w:r/>
             <w:r>
               <w:rPr>
@@ -5909,6 +6803,9 @@
             <w:vAlign w:val="center"/>
           </w:tcPr>
           <w:p>
+            <w:pPr>
+              <w:keepNext/>
+            </w:pPr>
             <w:r/>
             <w:r>
               <w:rPr>
@@ -5926,6 +6823,9 @@
             <w:vAlign w:val="center"/>
           </w:tcPr>
           <w:p>
+            <w:pPr>
+              <w:keepNext/>
+            </w:pPr>
             <w:r/>
             <w:r>
               <w:rPr>
@@ -5945,6 +6845,9 @@
             <w:vAlign w:val="center"/>
           </w:tcPr>
           <w:p>
+            <w:pPr>
+              <w:keepNext/>
+            </w:pPr>
             <w:r/>
             <w:r>
               <w:rPr>
@@ -5962,6 +6865,9 @@
             <w:vAlign w:val="center"/>
           </w:tcPr>
           <w:p>
+            <w:pPr>
+              <w:keepNext/>
+            </w:pPr>
             <w:r/>
             <w:r>
               <w:rPr>
@@ -6345,6 +7251,30 @@
           <w:rFonts w:ascii="Aptos Mono" w:hAnsi="Aptos Mono"/>
         </w:rPr>
         <w:t>hardware/kicad/Athena/exports/Athena-clock.pdf</w:t>
+      </w:r>
+    </w:p>
+    <w:p>
+      <w:pPr>
+        <w:widowControl/>
+      </w:pPr>
+      <w:r>
+        <w:t xml:space="preserve">19 September cross-check also includes docs/measurements/z80-run-mode-regression-2026-09-19.md, docs/experiments/z80-nmos-low-frequency-clock-2026-09-19.md and Athena_Z80_CPU_Bringup_Progress_Record.docx.</w:t>
+      </w:r>
+    </w:p>
+    <w:p>
+      <w:pPr>
+        <w:widowControl/>
+      </w:pPr>
+      <w:r>
+        <w:t xml:space="preserve">Chronological bench source: the 19 September discussion in Athena: Chat: Main Project, successor to the closed companion chat. Original measurement messages and subsequent corrections provide the chronology; the repository was checked at ffd4e58.</w:t>
+      </w:r>
+    </w:p>
+    <w:p>
+      <w:pPr>
+        <w:widowControl/>
+      </w:pPr>
+      <w:r>
+        <w:t xml:space="preserve">Remaining record discrepancies: the Markdown pin-8 pressed explanation still uses direct-switch wording; some README, milestone and measurement status text still lists NE556 pins 13/14 as outstanding despite their existing test-results entries; astable wiring still lists the original 1 µF instead of the documented 470 pF CPU adaptation. The KiCad issue is recorded in section 5.2. These external records have not been silently treated as current as-built evidence.</w:t>
       </w:r>
     </w:p>
     <w:sectPr>

</xml_diff>